<commit_message>
content: Google Scholar / ORCID / LinkedIn 프로필 URL 연결
- scholarUrl, orcidUrl, linkedinUrl 입력 → 사이드바 아이콘 + Contact 카드
  + JSON-LD sameAs 자동 활성화
- researchGate는 없어서 빈 채로 유지 (자동 숨김)

Co-Authored-By: Claude Opus 4.7 (1M context) <noreply@anthropic.com>
</commit_message>
<xml_diff>
--- a/cv/Lee_Seunghyeon_CV_v1.docx
+++ b/cv/Lee_Seunghyeon_CV_v1.docx
@@ -628,12 +628,32 @@
       <w:r>
         <w:rPr>
           <w:rFonts w:ascii="Calibri" w:hAnsi="Calibri"/>
+          <w:b/>
+          <w:i w:val="0"/>
+          <w:color w:val="1A1A1A"/>
+          <w:sz w:val="18"/>
+        </w:rPr>
+        <w:t>Seunghyeon Lee</w:t>
+      </w:r>
+      <w:r>
+        <w:rPr>
+          <w:rFonts w:ascii="Calibri" w:hAnsi="Calibri"/>
+          <w:b/>
+          <w:i w:val="0"/>
+          <w:color w:val="1F4E3D"/>
+          <w:sz w:val="18"/>
+        </w:rPr>
+        <w:t>†</w:t>
+      </w:r>
+      <w:r>
+        <w:rPr>
+          <w:rFonts w:ascii="Calibri" w:hAnsi="Calibri"/>
           <w:b w:val="0"/>
           <w:i w:val="0"/>
           <w:color w:val="1A1A1A"/>
           <w:sz w:val="18"/>
         </w:rPr>
-        <w:t>Gukhwa Jang</w:t>
+        <w:t xml:space="preserve">, </w:t>
       </w:r>
       <w:r>
         <w:rPr>
@@ -643,17 +663,7 @@
           <w:color w:val="1A1A1A"/>
           <w:sz w:val="18"/>
         </w:rPr>
-        <w:t xml:space="preserve">, </w:t>
-      </w:r>
-      <w:r>
-        <w:rPr>
-          <w:rFonts w:ascii="Calibri" w:hAnsi="Calibri"/>
-          <w:b/>
-          <w:i w:val="0"/>
-          <w:color w:val="1A1A1A"/>
-          <w:sz w:val="18"/>
-        </w:rPr>
-        <w:t>Seunghyeon Lee</w:t>
+        <w:t>Gukhwa Jang</w:t>
       </w:r>
       <w:r>
         <w:rPr>
@@ -724,6 +734,16 @@
           <w:sz w:val="18"/>
         </w:rPr>
         <w:t>KOSERT.</w:t>
+      </w:r>
+      <w:r>
+        <w:rPr>
+          <w:rFonts w:ascii="Calibri" w:hAnsi="Calibri"/>
+          <w:b w:val="0"/>
+          <w:i w:val="0"/>
+          <w:color w:val="888888"/>
+          <w:sz w:val="17"/>
+        </w:rPr>
+        <w:t xml:space="preserve">  doi:10.13087/kosert.2026.29.2.41</w:t>
       </w:r>
     </w:p>
     <w:p>

</xml_diff>